<commit_message>
Descripción de los cambios
</commit_message>
<xml_diff>
--- a/install/Guia-Nueva-Empresa-React.docx
+++ b/install/Guia-Nueva-Empresa-React.docx
@@ -1022,7 +1022,7 @@
         <w:spacing w:after="140"/>
       </w:pPr>
       <w:r>
-        <w:t xml:space="preserve">Hay un solo archivo que instala todo: supabase-TODO-EN-UNO.sql. Por dentro combina, en el orden correcto, las tablas, el cierre de seguridad, el candado de intentos y el almacenamiento de imágenes — no hace falta preocuparte por ese orden, ya viene resuelto.</w:t>
+        <w:t xml:space="preserve">Hay un solo archivo que instala todo: supabase-setup-final.sql (junto con reset-admin-password.sql y supabase-promote-superadmin.sql, que son aparte y opcionales — ver más abajo). Por dentro combina, en el orden correcto, las tablas, el cierre de seguridad, el candado de intentos y el almacenamiento de imágenes — no hace falta preocuparte por ese orden, ya viene resuelto.</w:t>
       </w:r>
     </w:p>
     <w:p>
@@ -1048,7 +1048,7 @@
         <w:spacing w:after="80"/>
       </w:pPr>
       <w:r>
-        <w:t xml:space="preserve">Abre el archivo supabase-TODO-EN-UNO.sql y copia TODO su contenido (es largo, son varios scripts juntos — copialo entero igual).</w:t>
+        <w:t xml:space="preserve">Abre el archivo supabase-setup-final.sql y copia TODO su contenido (es largo, son varios scripts juntos — copialo entero igual).</w:t>
       </w:r>
     </w:p>
     <w:p>
@@ -1415,6 +1415,36 @@
           </w:p>
         </w:tc>
       </w:tr>
+      <w:tr>
+        <w:tc>
+          <w:tcPr>
+            <w:tcW w:type="dxa" w:w="3200"/>
+          </w:tcPr>
+          <w:p>
+            <w:r>
+              <w:rPr>
+                <w:b w:val="false"/>
+                <w:bCs w:val="false"/>
+              </w:rPr>
+              <w:t xml:space="preserve">vapidPublicKey</w:t>
+            </w:r>
+          </w:p>
+        </w:tc>
+        <w:tc>
+          <w:tcPr>
+            <w:tcW w:type="dxa" w:w="5826"/>
+          </w:tcPr>
+          <w:p>
+            <w:r>
+              <w:rPr>
+                <w:b w:val="false"/>
+                <w:bCs w:val="false"/>
+              </w:rPr>
+              <w:t xml:space="preserve">Solo si esta empresa usa notificaciones push (Paso 7.4): la clave PÚBLICA generada ahí. Si no se usan notificaciones, dejar el valor de ejemplo no rompe nada.</w:t>
+            </w:r>
+          </w:p>
+        </w:tc>
+      </w:tr>
     </w:tbl>
     <w:p>
       <w:pPr>
@@ -2031,7 +2061,7 @@
         <w:spacing w:after="140"/>
       </w:pPr>
       <w:r>
-        <w:t xml:space="preserve">El proyecto usa dos funciones que corren del lado de Supabase (no en el navegador): una para resolver links de Google Maps, y otra que es la que permite subir y borrar imágenes (fotos de drivers, planes, logo, comprobantes de pago) de forma segura. Cada una se despliega por separado con la CLI de Supabase; los pasos de instalación y login (7.0) son comunes a las dos.</w:t>
+        <w:t xml:space="preserve">El proyecto usa cuatro funciones que corren del lado de Supabase (no en el navegador): una para resolver links de Google Maps, otra que permite subir y borrar imágenes (fotos de drivers, planes, logo, comprobantes de pago) de forma segura, otra que revisa los comprobantes de pago, y otra que manda las notificaciones push. Solo la de imágenes (7.2) es obligatoria; las otras tres son opcionales. Cada una se despliega por separado con la CLI de Supabase; los pasos de instalación y login (7.0) son comunes a las cuatro.</w:t>
       </w:r>
     </w:p>
     <w:p>
@@ -2360,7 +2390,167 @@
           <w:iCs/>
           <w:color w:val="0d6efd"/>
         </w:rPr>
-        <w:t xml:space="preserve">💡 El script SQL (supabase-TODO-EN-UNO.sql, sección de almacenamiento de imágenes) ya deja el bucket cerrado a la clave pública desde el Paso 3.2 — por eso esta función hay que desplegarla SIEMPRE en una empresa nueva, no es un ajuste posterior. Si alguna vez subir fotos deja de funcionar en una empresa que antes sí andaba, la causa más probable es que esta función se haya quedado sin desplegar (por ejemplo, en un proyecto de Supabase nuevo o recreado) — repetí estos pasos para esa empresa.</w:t>
+        <w:t xml:space="preserve">💡 El script SQL (supabase-setup-final.sql, sección de almacenamiento de imágenes) ya deja el bucket cerrado a la clave pública desde el Paso 3.2 — por eso esta función hay que desplegarla SIEMPRE en una empresa nueva, no es un ajuste posterior. Si alguna vez subir fotos deja de funcionar en una empresa que antes sí andaba, la causa más probable es que esta función se haya quedado sin desplegar (por ejemplo, en un proyecto de Supabase nuevo o recreado) — repetí estos pasos para esa empresa.</w:t>
+      </w:r>
+    </w:p>
+    <w:p>
+      <w:pPr>
+        <w:pStyle w:val="Heading2"/>
+        <w:spacing w:after="120" w:before="240"/>
+      </w:pPr>
+      <w:r>
+        <w:t xml:space="preserve">7.3 — Función de verificación de comprobantes de pago (opcional)</w:t>
+      </w:r>
+    </w:p>
+    <w:p>
+      <w:pPr>
+        <w:spacing w:after="140"/>
+      </w:pPr>
+      <w:r>
+        <w:t xml:space="preserve">Cuando un cliente sube la foto de su comprobante de pago desde el portal, esta función la revisa automáticamente y ayuda a confirmar la renovación sin que el equipo tenga que mirar cada foto a mano. Es opcional: si no se despliega, los comprobantes igual se suben y quedan guardados, pero el equipo tiene que revisarlos todos manualmente.</w:t>
+      </w:r>
+    </w:p>
+    <w:p>
+      <w:pPr>
+        <w:spacing w:after="140"/>
+      </w:pPr>
+      <w:r>
+        <w:rPr>
+          <w:rFonts w:ascii="Consolas" w:cs="Consolas" w:eastAsia="Consolas" w:hAnsi="Consolas"/>
+          <w:color w:val="1a1a1a"/>
+          <w:sz w:val="20"/>
+          <w:szCs w:val="20"/>
+        </w:rPr>
+        <w:t xml:space="preserve">npx supabase functions deploy verificar-comprobante --no-verify-jwt</w:t>
+      </w:r>
+    </w:p>
+    <w:p>
+      <w:pPr>
+        <w:spacing w:after="140"/>
+      </w:pPr>
+      <w:r>
+        <w:t xml:space="preserve">Probala subiendo un comprobante de prueba desde el portal de un cliente.</w:t>
+      </w:r>
+    </w:p>
+    <w:p>
+      <w:pPr>
+        <w:pStyle w:val="Heading2"/>
+        <w:spacing w:after="120" w:before="240"/>
+      </w:pPr>
+      <w:r>
+        <w:t xml:space="preserve">7.4 — Notificaciones push (opcional)</w:t>
+      </w:r>
+    </w:p>
+    <w:p>
+      <w:pPr>
+        <w:spacing w:after="140"/>
+      </w:pPr>
+      <w:r>
+        <w:t xml:space="preserve">Esta función manda avisos a la app instalada del cliente: un botón manual desde el menú Publicidad del Panel, y un aviso automático todos los días a las 9 AM a quien le queden 3 días o menos de plan. Es opcional y lleva más pasos que las otras dos funciones porque cada empresa necesita su PROPIO par de claves — no se puede reusar el de otra empresa.</w:t>
+      </w:r>
+    </w:p>
+    <w:p>
+      <w:pPr>
+        <w:spacing w:after="140"/>
+      </w:pPr>
+      <w:r>
+        <w:t xml:space="preserve">a) Generar el par de claves VAPID (una sola vez por empresa):</w:t>
+      </w:r>
+    </w:p>
+    <w:p>
+      <w:pPr>
+        <w:spacing w:after="140"/>
+      </w:pPr>
+      <w:r>
+        <w:rPr>
+          <w:rFonts w:ascii="Consolas" w:cs="Consolas" w:eastAsia="Consolas" w:hAnsi="Consolas"/>
+          <w:color w:val="1a1a1a"/>
+          <w:sz w:val="20"/>
+          <w:szCs w:val="20"/>
+        </w:rPr>
+        <w:t xml:space="preserve">npx --yes web-push generate-vapid-keys</w:t>
+      </w:r>
+    </w:p>
+    <w:p>
+      <w:pPr>
+        <w:spacing w:after="140"/>
+      </w:pPr>
+      <w:r>
+        <w:t xml:space="preserve">Va a imprimir una clave "Public Key" y otra "Private Key". La pública va en public/config.js, campo vapidPublicKey (ver Paso 4). La privada NUNCA va en config.js ni en ningún archivo del proyecto — se guarda solo como secreto de la función (paso c).</w:t>
+      </w:r>
+    </w:p>
+    <w:p>
+      <w:pPr>
+        <w:spacing w:after="140"/>
+      </w:pPr>
+      <w:r>
+        <w:t xml:space="preserve">b) Desplegar la función:</w:t>
+      </w:r>
+    </w:p>
+    <w:p>
+      <w:pPr>
+        <w:spacing w:after="140"/>
+      </w:pPr>
+      <w:r>
+        <w:rPr>
+          <w:rFonts w:ascii="Consolas" w:cs="Consolas" w:eastAsia="Consolas" w:hAnsi="Consolas"/>
+          <w:color w:val="1a1a1a"/>
+          <w:sz w:val="20"/>
+          <w:szCs w:val="20"/>
+        </w:rPr>
+        <w:t xml:space="preserve">npx supabase functions deploy send-push --no-verify-jwt</w:t>
+      </w:r>
+    </w:p>
+    <w:p>
+      <w:pPr>
+        <w:spacing w:after="140"/>
+      </w:pPr>
+      <w:r>
+        <w:t xml:space="preserve">c) En el Dashboard de Supabase → Edge Functions → send-push → Secrets, cargar cuatro valores: VAPID_PUBLIC_KEY y VAPID_PRIVATE_KEY (los del paso a), VAPID_SUBJECT (un mail real de la empresa con el prefijo "mailto:", ej. mailto:soporte@laempresa.com), y CRON_SECRET (cualquier texto largo al azar que inventes — sirve para que el aviso automático diario se identifique ante la función).</w:t>
+      </w:r>
+    </w:p>
+    <w:p>
+      <w:pPr>
+        <w:spacing w:after="140"/>
+      </w:pPr>
+      <w:r>
+        <w:t xml:space="preserve">d) Volver a la sección 20 de supabase-setup-final.sql (al final del archivo) y reemplazar &lt;CRON_SECRET&gt; por el mismo valor elegido en el paso c ANTES de correr esa sección — si ya corriste todo el archivo con el placeholder tal cual, volvé a correr solo el bloque "cron.schedule(...)" de esa sección con el valor correcto.</w:t>
+      </w:r>
+    </w:p>
+    <w:p>
+      <w:pPr>
+        <w:pBdr>
+          <w:left w:val="single" w:color="0d6efd" w:sz="12"/>
+        </w:pBdr>
+        <w:shd w:fill="EEF4FF" w:val="clear"/>
+        <w:spacing w:after="160" w:before="100"/>
+        <w:ind w:left="200"/>
+      </w:pPr>
+      <w:r>
+        <w:rPr>
+          <w:i/>
+          <w:iCs/>
+          <w:color w:val="0d6efd"/>
+        </w:rPr>
+        <w:t xml:space="preserve">💡 Para probarlo: instalá la PWA en un celular como cliente, aceptá el permiso de notificaciones al entrar al portal, y después mandate una notificación de prueba a vos mismo desde Publicidad → Enviar notificación manual.</w:t>
+      </w:r>
+    </w:p>
+    <w:p>
+      <w:pPr>
+        <w:pBdr>
+          <w:left w:val="single" w:color="E4002B" w:sz="12"/>
+        </w:pBdr>
+        <w:shd w:fill="FFF1EE" w:val="clear"/>
+        <w:spacing w:after="160" w:before="100"/>
+        <w:ind w:left="200"/>
+      </w:pPr>
+      <w:r>
+        <w:rPr>
+          <w:i/>
+          <w:iCs/>
+          <w:color w:val="B02A0A"/>
+        </w:rPr>
+        <w:t xml:space="preserve">⚠️ Si esta empresa no va a usar notificaciones push, se puede saltar todo el Paso 7.4 sin problema — el resto de la app funciona igual. Dejar vapidPublicKey con el valor de ejemplo en config.js no rompe nada si no se despliega send-push.</w:t>
       </w:r>
     </w:p>
     <w:p>
@@ -2769,7 +2959,7 @@
         <w:spacing w:after="80"/>
       </w:pPr>
       <w:r>
-        <w:t xml:space="preserve">☐  supabase-TODO-EN-UNO.sql corrido (un solo archivo, incluye los 4 scripts en el orden correcto).</w:t>
+        <w:t xml:space="preserve">☐  supabase-setup-final.sql corrido (un solo archivo, incluye todas las secciones en el orden correcto).</w:t>
       </w:r>
     </w:p>
     <w:p>
@@ -2826,6 +3016,22 @@
       </w:pPr>
       <w:r>
         <w:t xml:space="preserve">☐  Función resolve-maps-link desplegada (Paso 7.1, opcional) y probada con un link corto de Google Maps.</w:t>
+      </w:r>
+    </w:p>
+    <w:p>
+      <w:pPr>
+        <w:spacing w:after="80"/>
+      </w:pPr>
+      <w:r>
+        <w:t xml:space="preserve">☐  Función verificar-comprobante desplegada (Paso 7.3, opcional).</w:t>
+      </w:r>
+    </w:p>
+    <w:p>
+      <w:pPr>
+        <w:spacing w:after="80"/>
+      </w:pPr>
+      <w:r>
+        <w:t xml:space="preserve">☐  Notificaciones push (Paso 7.4, opcional): claves VAPID generadas, vapidPublicKey en config.js, función send-push desplegada, los 4 secretos cargados, &lt;CRON_SECRET&gt; reemplazado en la sección 20 del SQL, y una notificación de prueba recibida.</w:t>
       </w:r>
     </w:p>
     <w:p>

</xml_diff>